<commit_message>
Fix: Enable multi-line break for vendor data in stable docxtemplater
</commit_message>
<xml_diff>
--- a/商情分析表template.docx
+++ b/商情分析表template.docx
@@ -857,8 +857,6 @@
             </w:r>
           </w:p>
         </w:tc>
-        <w:bookmarkStart w:id="0" w:name="_GoBack"/>
-        <w:bookmarkEnd w:id="0"/>
       </w:tr>
       <w:tr>
         <w:trPr>
@@ -1048,8 +1046,10 @@
               </w:rPr>
             </w:pPr>
             <w:r>
-              <w:t>{source_data}</w:t>
-            </w:r>
+              <w:t>{#source_data}{text}{/source_data}</w:t>
+            </w:r>
+            <w:bookmarkStart w:id="0" w:name="_GoBack"/>
+            <w:bookmarkEnd w:id="0"/>
           </w:p>
           <w:p>
             <w:pPr>
@@ -3451,7 +3451,7 @@
 </file>
 
 <file path=customXml/itemProps1.xml><?xml version="1.0" encoding="utf-8"?>
-<ds:datastoreItem xmlns:ds="http://schemas.openxmlformats.org/officeDocument/2006/customXml" ds:itemID="{1EA84BD0-3361-4093-9C1C-D2A9E31F0217}">
+<ds:datastoreItem xmlns:ds="http://schemas.openxmlformats.org/officeDocument/2006/customXml" ds:itemID="{E9FDAD6D-D29E-4A13-8CB7-0D3610CDE4E7}">
   <ds:schemaRefs>
     <ds:schemaRef ds:uri="http://schemas.openxmlformats.org/officeDocument/2006/bibliography"/>
   </ds:schemaRefs>

</xml_diff>

<commit_message>
Fix: Add @ prefix to templateData keys to match word template
</commit_message>
<xml_diff>
--- a/商情分析表template.docx
+++ b/商情分析表template.docx
@@ -1010,7 +1010,13 @@
               </w:rPr>
             </w:pPr>
             <w:r>
-              <w:t>{purpose}</w:t>
+              <w:t>{</w:t>
+            </w:r>
+            <w:r>
+              <w:t>@</w:t>
+            </w:r>
+            <w:r>
+              <w:t>purpose}</w:t>
             </w:r>
           </w:p>
           <w:p>
@@ -1046,10 +1052,14 @@
               </w:rPr>
             </w:pPr>
             <w:r>
-              <w:t>{#source_data}{text}{/source_data}</w:t>
-            </w:r>
-            <w:bookmarkStart w:id="0" w:name="_GoBack"/>
-            <w:bookmarkEnd w:id="0"/>
+              <w:t>{</w:t>
+            </w:r>
+            <w:r>
+              <w:t>@</w:t>
+            </w:r>
+            <w:r>
+              <w:t>source_data}</w:t>
+            </w:r>
           </w:p>
           <w:p>
             <w:pPr>
@@ -1084,7 +1094,13 @@
               </w:rPr>
             </w:pPr>
             <w:r>
-              <w:t>{prev_records}</w:t>
+              <w:t>{</w:t>
+            </w:r>
+            <w:r>
+              <w:t>@</w:t>
+            </w:r>
+            <w:r>
+              <w:t>prev_records}</w:t>
             </w:r>
           </w:p>
           <w:p>
@@ -1120,7 +1136,13 @@
               </w:rPr>
             </w:pPr>
             <w:r>
-              <w:t>{other_military_records}</w:t>
+              <w:t>{</w:t>
+            </w:r>
+            <w:r>
+              <w:t>@</w:t>
+            </w:r>
+            <w:r>
+              <w:t>other_military_records}</w:t>
             </w:r>
           </w:p>
           <w:p>
@@ -1155,7 +1177,13 @@
               </w:rPr>
             </w:pPr>
             <w:r>
-              <w:t>{other_market_prices}</w:t>
+              <w:t>{</w:t>
+            </w:r>
+            <w:r>
+              <w:t>@</w:t>
+            </w:r>
+            <w:r>
+              <w:t>other_market_prices}</w:t>
             </w:r>
           </w:p>
           <w:p>
@@ -1190,7 +1218,13 @@
               </w:rPr>
             </w:pPr>
             <w:r>
-              <w:t>{market_survey}</w:t>
+              <w:t>{</w:t>
+            </w:r>
+            <w:r>
+              <w:t>@</w:t>
+            </w:r>
+            <w:r>
+              <w:t>market_survey}</w:t>
             </w:r>
           </w:p>
           <w:p>
@@ -1226,7 +1260,13 @@
               </w:rPr>
             </w:pPr>
             <w:r>
-              <w:t>{discount_records}</w:t>
+              <w:t>{</w:t>
+            </w:r>
+            <w:r>
+              <w:t>@</w:t>
+            </w:r>
+            <w:r>
+              <w:t>discount_records}</w:t>
             </w:r>
           </w:p>
           <w:p>
@@ -1269,7 +1309,13 @@
               <w:t xml:space="preserve">    </w:t>
             </w:r>
             <w:r>
-              <w:t>{price_index}</w:t>
+              <w:t>{</w:t>
+            </w:r>
+            <w:r>
+              <w:t>@</w:t>
+            </w:r>
+            <w:r>
+              <w:t>price_index}</w:t>
             </w:r>
           </w:p>
           <w:p>
@@ -1305,7 +1351,13 @@
               </w:rPr>
             </w:pPr>
             <w:r>
-              <w:t>{cost_analysis}</w:t>
+              <w:t>{</w:t>
+            </w:r>
+            <w:r>
+              <w:t>@</w:t>
+            </w:r>
+            <w:r>
+              <w:t>cost_analysis}</w:t>
             </w:r>
           </w:p>
           <w:p>
@@ -1339,7 +1391,15 @@
               </w:rPr>
             </w:pPr>
             <w:r>
-              <w:t>{conclusion}</w:t>
+              <w:t>{</w:t>
+            </w:r>
+            <w:r>
+              <w:t>@</w:t>
+            </w:r>
+            <w:bookmarkStart w:id="0" w:name="_GoBack"/>
+            <w:bookmarkEnd w:id="0"/>
+            <w:r>
+              <w:t>conclusion}</w:t>
             </w:r>
           </w:p>
         </w:tc>
@@ -3451,7 +3511,7 @@
 </file>
 
 <file path=customXml/itemProps1.xml><?xml version="1.0" encoding="utf-8"?>
-<ds:datastoreItem xmlns:ds="http://schemas.openxmlformats.org/officeDocument/2006/customXml" ds:itemID="{E9FDAD6D-D29E-4A13-8CB7-0D3610CDE4E7}">
+<ds:datastoreItem xmlns:ds="http://schemas.openxmlformats.org/officeDocument/2006/customXml" ds:itemID="{1C891E8D-F094-4926-971C-A3DD106FD83F}">
   <ds:schemaRefs>
     <ds:schemaRef ds:uri="http://schemas.openxmlformats.org/officeDocument/2006/bibliography"/>
   </ds:schemaRefs>

</xml_diff>

<commit_message>
Fix: stable array paragraph loop implementation
</commit_message>
<xml_diff>
--- a/商情分析表template.docx
+++ b/商情分析表template.docx
@@ -1010,13 +1010,7 @@
               </w:rPr>
             </w:pPr>
             <w:r>
-              <w:t>{</w:t>
-            </w:r>
-            <w:r>
-              <w:t>@</w:t>
-            </w:r>
-            <w:r>
-              <w:t>purpose}</w:t>
+              <w:t>{#purpose}{line}{/purpose}</w:t>
             </w:r>
           </w:p>
           <w:p>
@@ -1052,13 +1046,7 @@
               </w:rPr>
             </w:pPr>
             <w:r>
-              <w:t>{</w:t>
-            </w:r>
-            <w:r>
-              <w:t>@</w:t>
-            </w:r>
-            <w:r>
-              <w:t>source_data}</w:t>
+              <w:t>{#source_data}{line}{/source_data}</w:t>
             </w:r>
           </w:p>
           <w:p>
@@ -1094,13 +1082,7 @@
               </w:rPr>
             </w:pPr>
             <w:r>
-              <w:t>{</w:t>
-            </w:r>
-            <w:r>
-              <w:t>@</w:t>
-            </w:r>
-            <w:r>
-              <w:t>prev_records}</w:t>
+              <w:t>{#prev_records}{line}{/prev_records}</w:t>
             </w:r>
           </w:p>
           <w:p>
@@ -1136,13 +1118,7 @@
               </w:rPr>
             </w:pPr>
             <w:r>
-              <w:t>{</w:t>
-            </w:r>
-            <w:r>
-              <w:t>@</w:t>
-            </w:r>
-            <w:r>
-              <w:t>other_military_records}</w:t>
+              <w:t>{#other_military_records}{line}{/other_military_records}</w:t>
             </w:r>
           </w:p>
           <w:p>
@@ -1177,13 +1153,7 @@
               </w:rPr>
             </w:pPr>
             <w:r>
-              <w:t>{</w:t>
-            </w:r>
-            <w:r>
-              <w:t>@</w:t>
-            </w:r>
-            <w:r>
-              <w:t>other_market_prices}</w:t>
+              <w:t>{#other_market_prices}{line}{/other_market_prices}</w:t>
             </w:r>
           </w:p>
           <w:p>
@@ -1218,13 +1188,7 @@
               </w:rPr>
             </w:pPr>
             <w:r>
-              <w:t>{</w:t>
-            </w:r>
-            <w:r>
-              <w:t>@</w:t>
-            </w:r>
-            <w:r>
-              <w:t>market_survey}</w:t>
+              <w:t>{#market_survey}{line}{/market_survey}</w:t>
             </w:r>
           </w:p>
           <w:p>
@@ -1260,13 +1224,7 @@
               </w:rPr>
             </w:pPr>
             <w:r>
-              <w:t>{</w:t>
-            </w:r>
-            <w:r>
-              <w:t>@</w:t>
-            </w:r>
-            <w:r>
-              <w:t>discount_records}</w:t>
+              <w:t>{#discount_records}{line}{/discount_records}</w:t>
             </w:r>
           </w:p>
           <w:p>
@@ -1309,13 +1267,7 @@
               <w:t xml:space="preserve">    </w:t>
             </w:r>
             <w:r>
-              <w:t>{</w:t>
-            </w:r>
-            <w:r>
-              <w:t>@</w:t>
-            </w:r>
-            <w:r>
-              <w:t>price_index}</w:t>
+              <w:t>{#price_index}{line}{/price_index}</w:t>
             </w:r>
           </w:p>
           <w:p>
@@ -1351,13 +1303,7 @@
               </w:rPr>
             </w:pPr>
             <w:r>
-              <w:t>{</w:t>
-            </w:r>
-            <w:r>
-              <w:t>@</w:t>
-            </w:r>
-            <w:r>
-              <w:t>cost_analysis}</w:t>
+              <w:t>{#cost_analysis}{line}{/cost_analysis}</w:t>
             </w:r>
           </w:p>
           <w:p>
@@ -1384,22 +1330,19 @@
           <w:p>
             <w:pPr>
               <w:spacing w:line="0" w:lineRule="atLeast"/>
-              <w:ind w:left="438"/>
+              <w:ind w:left="520"/>
               <w:jc w:val="both"/>
               <w:rPr>
                 <w:sz w:val="24"/>
               </w:rPr>
             </w:pPr>
             <w:r>
-              <w:t>{</w:t>
-            </w:r>
-            <w:r>
-              <w:t>@</w:t>
+              <w:t>{#conc</w:t>
             </w:r>
             <w:bookmarkStart w:id="0" w:name="_GoBack"/>
             <w:bookmarkEnd w:id="0"/>
             <w:r>
-              <w:t>conclusion}</w:t>
+              <w:t>lusion}{line}{/conclusion}</w:t>
             </w:r>
           </w:p>
         </w:tc>
@@ -3511,7 +3454,7 @@
 </file>
 
 <file path=customXml/itemProps1.xml><?xml version="1.0" encoding="utf-8"?>
-<ds:datastoreItem xmlns:ds="http://schemas.openxmlformats.org/officeDocument/2006/customXml" ds:itemID="{1C891E8D-F094-4926-971C-A3DD106FD83F}">
+<ds:datastoreItem xmlns:ds="http://schemas.openxmlformats.org/officeDocument/2006/customXml" ds:itemID="{91A54DF7-E1FE-45A5-B5BC-699AED8F936C}">
   <ds:schemaRefs>
     <ds:schemaRef ds:uri="http://schemas.openxmlformats.org/officeDocument/2006/bibliography"/>
   </ds:schemaRefs>

</xml_diff>